<commit_message>
Update resume's Portfolio link to bergstromgis.com
</commit_message>
<xml_diff>
--- a/docs/resume/Brian-Bergstrom-resume.docx
+++ b/docs/resume/Brian-Bergstrom-resume.docx
@@ -69,14 +69,14 @@
       </w:pPr>
       <w:r>
         <w:rPr/>
-        <w:t xml:space="preserve">Porfolio: </w:t>
+        <w:t xml:space="preserve">Portfolio: </w:t>
       </w:r>
       <w:hyperlink r:id="rId4">
         <w:r>
           <w:rPr>
             <w:rStyle w:val="Hyperlink"/>
           </w:rPr>
-          <w:t>https://sites.google.com/view/brian-bergstrom/</w:t>
+          <w:t>bergstromgis.com</w:t>
         </w:r>
       </w:hyperlink>
     </w:p>

</xml_diff>